<commit_message>
Complete COM2058 submission: F1 UI, fixes, and deliverables.
Integrate the Mdevyl Formula-1 frontend, fix circuit image paths, add Phase 4 report and submission ZIPs, expand sample SQL queries, and add smoke/submission scripts.

Co-authored-by: Cursor <cursoragent@cursor.com>
</commit_message>
<xml_diff>
--- a/Requirements.docx
+++ b/Requirements.docx
@@ -28,10 +28,7 @@
         <w:t xml:space="preserve">Group: </w:t>
       </w:r>
       <w:r>
-        <w:rPr>
-          <w:i/>
-        </w:rPr>
-        <w:t>TODO: names &amp; student IDs</w:t>
+        <w:t>Sarp Mataş</w:t>
       </w:r>
     </w:p>
     <w:p>

</xml_diff>